<commit_message>
chore(drive-eval): fixture texts, trees and gold move to the invented universe
Names, places, organisations and values in the drive eval's fixture sources
follow the invented universe; Russian-language documents keep their language,
Russian file and folder names become Ukrainian, the trip notes are about
Coimbra in Ukrainian, the photo folders are Coimbra 2024 and Hamburg, the
landmark photo is in Berlin. Rendered files regenerated with make_fixtures
(changed files only) and make_fixtures_v2. Test data that quoted the old
fixture values follows them (reviewer: data-only, same assertions).

The recorded enrichment, the v1 baseline and the G1/G2 bars are re-recorded
in the next commits.

Co-Authored-By: Claude Opus 5.5 <noreply@anthropic.com>
</commit_message>
<xml_diff>
--- a/tests/fixtures/drive_eval/files/dogovor_red1.docx
+++ b/tests/fixtures/drive_eval/files/dogovor_red1.docx
@@ -12,12 +12,12 @@
     </w:p>
     <w:p>
       <w:r>
-        <w:t>г. Самара, 03.11.2025</w:t>
+        <w:t>г. Львів, 03.11.2025</w:t>
       </w:r>
     </w:p>
     <w:p>
       <w:r>
-        <w:t>ООО «Пример Сервис» (Исполнитель) и ИП Образцов А. В. (Заказчик) заключили настоящий договор о нижеследующем.</w:t>
+        <w:t>ТОВ «Приклад» (Исполнитель) и ФОП Мельник Т. (Заказчик) заключили настоящий договор о нижеследующем.</w:t>
       </w:r>
     </w:p>
     <w:p>
@@ -27,7 +27,7 @@
     </w:p>
     <w:p>
       <w:r>
-        <w:t>2. Стоимость услуг составляет 40 000 рублей в месяц, без НДС. Оплата до 10 числа текущего месяца.</w:t>
+        <w:t>2. Стоимость услуг составляет 40 000 гривен в месяц, без НДС. Оплата до 10 числа текущего месяца.</w:t>
       </w:r>
     </w:p>
     <w:p>

</xml_diff>